<commit_message>
Add manual-retraction section to awning troubleshooting guide
Confirms the operator's manual has no crank/override procedure for
the awning (unlike the roof vent, which does), explains why the
procedure is brand-specific enough that it can't be guessed safely,
and gives two paths to the real answer: the InfoCase manual, or
identifying the brand from the motor housing nameplate.
</commit_message>
<xml_diff>
--- a/27R/27R_Awning_Not_Retracting_Troubleshooting.docx
+++ b/27R/27R_Awning_Not_Retracting_Troubleshooting.docx
@@ -472,12 +472,114 @@
         <w:pStyle w:val="Heading2"/>
       </w:pPr>
       <w:r>
-        <w:t>Part 4 — When to Stop and Call for Help</w:t>
+        <w:t>Part 4 — Manual Retraction — Confirmed Gap in This Coach's Documentation</w:t>
       </w:r>
     </w:p>
     <w:p>
       <w:r>
-        <w:t>If the awning has a manual crank or mechanical override for motor failure, that procedure lives in the awning manufacturer's guide in the InfoCase, not in the coach's base operator's manual — check there before attempting any manual retraction you're not sure about.</w:t>
+        <w:t xml:space="preserve">Checked specifically: the operator's manual documents a manual/crank override for other powered components — the Power Roof Ventilator has a documented "Dome Crank knob" for use during a power failure, for example — but it has </w:t>
+      </w:r>
+      <w:r>
+        <w:rPr>
+          <w:b/>
+        </w:rPr>
+        <w:t>no manual-retract or crank procedure for the awning anywhere in the manual or the wiring diagrams</w:t>
+      </w:r>
+      <w:r>
+        <w:t>. It only defers to "the Awning manufacturer's user guide provided in your InfoCase."</w:t>
+      </w:r>
+    </w:p>
+    <w:p>
+      <w:r>
+        <w:rPr>
+          <w:b/>
+        </w:rPr>
+        <w:t>Why there's no generic set of steps to give here:</w:t>
+      </w:r>
+      <w:r>
+        <w:t xml:space="preserve"> manual-override mechanisms differ significantly by awning brand and model, and guessing wrong risks real damage or injury:</w:t>
+      </w:r>
+    </w:p>
+    <w:p>
+      <w:r>
+        <w:t xml:space="preserve">• Bluetooth-controlled awnings (Girard-style) often have </w:t>
+      </w:r>
+      <w:r>
+        <w:rPr>
+          <w:b/>
+        </w:rPr>
+        <w:t>no crank at all</w:t>
+      </w:r>
+      <w:r>
+        <w:t xml:space="preserve"> — releasing them manually means removing the motor housing and turning the drive shaft directly with a hex key/socket.</w:t>
+      </w:r>
+    </w:p>
+    <w:p>
+      <w:r>
+        <w:t>• Others (Solera, Carefree, Dometic) commonly have a small crank port or a manual-release lever built into the motor end.</w:t>
+      </w:r>
+    </w:p>
+    <w:p>
+      <w:r>
+        <w:t xml:space="preserve">• Some newer powered-only designs have </w:t>
+      </w:r>
+      <w:r>
+        <w:rPr>
+          <w:b/>
+        </w:rPr>
+        <w:t>no field-serviceable manual override</w:t>
+      </w:r>
+      <w:r>
+        <w:t xml:space="preserve"> and require a technician.</w:t>
+      </w:r>
+    </w:p>
+    <w:p>
+      <w:r>
+        <w:rPr>
+          <w:b/>
+        </w:rPr>
+        <w:t>Two ways to get the actual procedure for this awning:</w:t>
+      </w:r>
+    </w:p>
+    <w:p>
+      <w:r>
+        <w:rPr>
+          <w:b/>
+        </w:rPr>
+        <w:t>1.</w:t>
+      </w:r>
+      <w:r>
+        <w:t xml:space="preserve"> Check the InfoCase for the awning's own manufacturer's manual — it should be filed there separately from the coach operator's manual.</w:t>
+      </w:r>
+    </w:p>
+    <w:p>
+      <w:r>
+        <w:rPr>
+          <w:b/>
+        </w:rPr>
+        <w:t>2.</w:t>
+      </w:r>
+      <w:r>
+        <w:t xml:space="preserve"> Look for a brand/model sticker on the motor housing (the tube-shaped part at the roof line where the arms pivot) and look up that model's manual override procedure directly, or provide the brand/model for a model-specific lookup.</w:t>
+      </w:r>
+    </w:p>
+    <w:p>
+      <w:r>
+        <w:rPr>
+          <w:b/>
+        </w:rPr>
+        <w:t>If it's currently stuck extended:</w:t>
+      </w:r>
+      <w:r>
+        <w:t xml:space="preserve"> don't force the mechanism, and don't drive with it out. If wind or weather is a factor before you can resolve it, treat it as urgent — Winnebago roadside assistance or the nearest dealer is the safer path than improvising a release.</w:t>
+      </w:r>
+    </w:p>
+    <w:p>
+      <w:pPr>
+        <w:pStyle w:val="Heading2"/>
+      </w:pPr>
+      <w:r>
+        <w:t>Part 5 — When to Stop and Call for Help</w:t>
       </w:r>
     </w:p>
     <w:p>

</xml_diff>

<commit_message>
Identify awning as Girard GG750, add verified manual override procedure
Nameplate photo confirmed the brand/model (Lippert's Girard GG750,
16'x8' 12VDC patio awning). Downloaded the official Girard GG750
Installation, Service and Repair Manual and replaced the earlier
generic "brand unknown" guidance with the verified manual-retraction
steps (one-way, retract-only override via a 13mm wrench on the
non-motor end cap), Girard's own "motor won't operate" checklist
(fuse, Awnings Power Main Switch), the duty-cycle warning, and the
direct Girard Systems support line.
</commit_message>
<xml_diff>
--- a/27R/27R_Awning_Not_Retracting_Troubleshooting.docx
+++ b/27R/27R_Awning_Not_Retracting_Troubleshooting.docx
@@ -31,7 +31,7 @@
         <w:t>What you need:</w:t>
       </w:r>
       <w:r>
-        <w:t xml:space="preserve"> WinConnect touchscreen, phone with the awning's Bluetooth app (if paired), flashlight, a second person to watch the mechanism while you operate the switch.</w:t>
+        <w:t xml:space="preserve"> WinConnect touchscreen, phone with the awning's Bluetooth app (if paired), flashlight, Phillips screwdriver and a 13mm wrench (for manual retraction), a second person to watch the mechanism while you operate the switch.</w:t>
       </w:r>
     </w:p>
     <w:p>
@@ -80,7 +80,25 @@
     </w:p>
     <w:p>
       <w:r>
-        <w:t>The base operator's manual does not name the awning's manufacturer and has no dedicated troubleshooting section for it — it defers to "the Awning manufacturer's user guide provided in your InfoCase" for complete operating instructions, features, and maintenance care. Check there for anything beyond what's covered here, including any manual crank/override procedure in case of a motor failure.</w:t>
+        <w:t xml:space="preserve">The base operator's manual does not name the awning's manufacturer and has no dedicated troubleshooting section for it — it defers to "the Awning manufacturer's user guide provided in your InfoCase" for complete operating instructions. </w:t>
+      </w:r>
+      <w:r>
+        <w:rPr>
+          <w:b/>
+        </w:rPr>
+        <w:t>Confirmed from the nameplate on the awning box:</w:t>
+      </w:r>
+      <w:r>
+        <w:t xml:space="preserve"> this is a </w:t>
+      </w:r>
+      <w:r>
+        <w:rPr>
+          <w:b/>
+        </w:rPr>
+        <w:t>Girard GG750</w:t>
+      </w:r>
+      <w:r>
+        <w:t xml:space="preserve"> (Lippert brand), 16' x 8' patio awning, 12VDC, motion-sensor-equipped. That identification is what makes Parts 3 and 4 below model-specific rather than generic.</w:t>
       </w:r>
     </w:p>
     <w:p>
@@ -395,6 +413,14 @@
       </w:r>
     </w:p>
     <w:p>
+      <w:pPr>
+        <w:pStyle w:val="ListBullet"/>
+      </w:pPr>
+      <w:r>
+        <w:t>Per Girard's own official troubleshooting for this exact model: also check the panel fuse on the 12VDC circuit feeding the awning, and check for a dedicated "Awnings Power Main Switch" if this coach has one — both are named directly in the manufacturer's guide as the first things to check for a motor that won't operate at all.</w:t>
+      </w:r>
+    </w:p>
+    <w:p>
       <w:r>
         <w:rPr>
           <w:i/>
@@ -472,21 +498,124 @@
         <w:pStyle w:val="Heading2"/>
       </w:pPr>
       <w:r>
-        <w:t>Part 4 — Manual Retraction — Confirmed Gap in This Coach's Documentation</w:t>
+        <w:t>Part 4 — Manual Retraction — Verified Girard GG750 Procedure</w:t>
       </w:r>
     </w:p>
     <w:p>
       <w:r>
-        <w:t xml:space="preserve">Checked specifically: the operator's manual documents a manual/crank override for other powered components — the Power Roof Ventilator has a documented "Dome Crank knob" for use during a power failure, for example — but it has </w:t>
+        <w:t>The coach's own operator's manual has no crank/override procedure for the awning — this comes directly from Girard's official GG750 Installation, Service and Repair Manual.</w:t>
+      </w:r>
+    </w:p>
+    <w:p>
+      <w:pPr>
+        <w:pStyle w:val="Heading3"/>
+      </w:pPr>
+      <w:r>
+        <w:t>☐ 1. Know the limitation before you start — IMPORTANT</w:t>
+      </w:r>
+    </w:p>
+    <w:p>
+      <w:pPr>
+        <w:pStyle w:val="ListBullet"/>
+      </w:pPr>
+      <w:r>
+        <w:t xml:space="preserve">The GG750's manual override is </w:t>
       </w:r>
       <w:r>
         <w:rPr>
           <w:b/>
         </w:rPr>
-        <w:t>no manual-retract or crank procedure for the awning anywhere in the manual or the wiring diagrams</w:t>
+        <w:t>one-way: it can only close (retract) the awning, not extend it.</w:t>
+      </w:r>
+    </w:p>
+    <w:p>
+      <w:pPr>
+        <w:pStyle w:val="ListBullet"/>
+      </w:pPr>
+      <w:r>
+        <w:t>The procedure differs by which side the motor is on — the manual shows a right-hand motor version; if this coach has a left-hand version, the override is on the opposite endcap from what's pictured.</w:t>
+      </w:r>
+    </w:p>
+    <w:p>
+      <w:r>
+        <w:rPr>
+          <w:i/>
+        </w:rPr>
+        <w:t>Why this matters:</w:t>
       </w:r>
       <w:r>
-        <w:t>. It only defers to "the Awning manufacturer's user guide provided in your InfoCase."</w:t>
+        <w:t xml:space="preserve"> Knowing it's retract-only and side-dependent up front avoids wasted effort looking for an extend override that doesn't exist, or opening the wrong end cap.</w:t>
+      </w:r>
+    </w:p>
+    <w:p>
+      <w:pPr>
+        <w:pStyle w:val="Heading3"/>
+      </w:pPr>
+      <w:r>
+        <w:t>☐ 2. Remove the end cap opposite the motor</w:t>
+      </w:r>
+    </w:p>
+    <w:p>
+      <w:pPr>
+        <w:pStyle w:val="ListBullet"/>
+      </w:pPr>
+      <w:r>
+        <w:t xml:space="preserve">Remove the 3 Phillips-head screws holding on the end cap on the side </w:t>
+      </w:r>
+      <w:r>
+        <w:rPr>
+          <w:b/>
+        </w:rPr>
+        <w:t>opposite</w:t>
+      </w:r>
+      <w:r>
+        <w:t xml:space="preserve"> the motor.</w:t>
+      </w:r>
+    </w:p>
+    <w:p>
+      <w:r>
+        <w:rPr>
+          <w:i/>
+        </w:rPr>
+        <w:t>Why this matters:</w:t>
+      </w:r>
+      <w:r>
+        <w:t xml:space="preserve"> The override shaft is accessed from the non-motor end, not the motor end itself.</w:t>
+      </w:r>
+    </w:p>
+    <w:p>
+      <w:pPr>
+        <w:pStyle w:val="Heading3"/>
+      </w:pPr>
+      <w:r>
+        <w:t>☐ 3. Turn the manual override shaft closed with a 13mm wrench</w:t>
+      </w:r>
+    </w:p>
+    <w:p>
+      <w:pPr>
+        <w:pStyle w:val="ListBullet"/>
+      </w:pPr>
+      <w:r>
+        <w:t>Using a 13mm wrench on the exposed override shaft, turn it to close the awning (per Girard's Figure 10 in the official manual).</w:t>
+      </w:r>
+    </w:p>
+    <w:p>
+      <w:r>
+        <w:rPr>
+          <w:i/>
+        </w:rPr>
+        <w:t>Why this matters:</w:t>
+      </w:r>
+      <w:r>
+        <w:t xml:space="preserve"> This is the verified, manufacturer-documented method for this exact model — not a generic RV-awning workaround.</w:t>
+      </w:r>
+    </w:p>
+    <w:p>
+      <w:pPr>
+        <w:pStyle w:val="Heading2"/>
+      </w:pPr>
+      <w:r>
+        <w:t>—</w:t>
       </w:r>
     </w:p>
     <w:p>
@@ -494,51 +623,10 @@
         <w:rPr>
           <w:b/>
         </w:rPr>
-        <w:t>Why there's no generic set of steps to give here:</w:t>
+        <w:t>If the motor won't operate at all</w:t>
       </w:r>
       <w:r>
-        <w:t xml:space="preserve"> manual-override mechanisms differ significantly by awning brand and model, and guessing wrong risks real damage or injury:</w:t>
-      </w:r>
-    </w:p>
-    <w:p>
-      <w:r>
-        <w:t xml:space="preserve">• Bluetooth-controlled awnings (Girard-style) often have </w:t>
-      </w:r>
-      <w:r>
-        <w:rPr>
-          <w:b/>
-        </w:rPr>
-        <w:t>no crank at all</w:t>
-      </w:r>
-      <w:r>
-        <w:t xml:space="preserve"> — releasing them manually means removing the motor housing and turning the drive shaft directly with a hex key/socket.</w:t>
-      </w:r>
-    </w:p>
-    <w:p>
-      <w:r>
-        <w:t>• Others (Solera, Carefree, Dometic) commonly have a small crank port or a manual-release lever built into the motor end.</w:t>
-      </w:r>
-    </w:p>
-    <w:p>
-      <w:r>
-        <w:t xml:space="preserve">• Some newer powered-only designs have </w:t>
-      </w:r>
-      <w:r>
-        <w:rPr>
-          <w:b/>
-        </w:rPr>
-        <w:t>no field-serviceable manual override</w:t>
-      </w:r>
-      <w:r>
-        <w:t xml:space="preserve"> and require a technician.</w:t>
-      </w:r>
-    </w:p>
-    <w:p>
-      <w:r>
-        <w:rPr>
-          <w:b/>
-        </w:rPr>
-        <w:t>Two ways to get the actual procedure for this awning:</w:t>
+        <w:t xml:space="preserve"> (the original symptom), Girard's own troubleshooting guide for this model says to check these two things before anything else, and gives a direct support line if they don't resolve it:</w:t>
       </w:r>
     </w:p>
     <w:p>
@@ -549,7 +637,7 @@
         <w:t>1.</w:t>
       </w:r>
       <w:r>
-        <w:t xml:space="preserve"> Check the InfoCase for the awning's own manufacturer's manual — it should be filed there separately from the coach operator's manual.</w:t>
+        <w:t xml:space="preserve"> Check that the panel fuse on the 12VDC circuit is good.</w:t>
       </w:r>
     </w:p>
     <w:p>
@@ -560,7 +648,7 @@
         <w:t>2.</w:t>
       </w:r>
       <w:r>
-        <w:t xml:space="preserve"> Look for a brand/model sticker on the motor housing (the tube-shaped part at the roof line where the arms pivot) and look up that model's manual override procedure directly, or provide the brand/model for a model-specific lookup.</w:t>
+        <w:t xml:space="preserve"> If the coach has an "Awnings Power Main Switch," confirm it's in the ON position.</w:t>
       </w:r>
     </w:p>
     <w:p>
@@ -568,10 +656,53 @@
         <w:rPr>
           <w:b/>
         </w:rPr>
-        <w:t>If it's currently stuck extended:</w:t>
+        <w:t>3.</w:t>
       </w:r>
       <w:r>
-        <w:t xml:space="preserve"> don't force the mechanism, and don't drive with it out. If wind or weather is a factor before you can resolve it, treat it as urgent — Winnebago roadside assistance or the nearest dealer is the safer path than improvising a release.</w:t>
+        <w:t xml:space="preserve"> If that doesn't solve it, call the Girard Systems service line directly: </w:t>
+      </w:r>
+      <w:r>
+        <w:rPr>
+          <w:b/>
+        </w:rPr>
+        <w:t>(949) 259-4000</w:t>
+      </w:r>
+      <w:r>
+        <w:t xml:space="preserve"> or toll-free </w:t>
+      </w:r>
+      <w:r>
+        <w:rPr>
+          <w:b/>
+        </w:rPr>
+        <w:t>(800) 382-8442</w:t>
+      </w:r>
+      <w:r>
+        <w:t>.</w:t>
+      </w:r>
+    </w:p>
+    <w:p>
+      <w:r>
+        <w:rPr>
+          <w:b/>
+        </w:rPr>
+        <w:t>Duty cycle warning from the manual:</w:t>
+      </w:r>
+      <w:r>
+        <w:t xml:space="preserve"> to prevent motor overheating, don't exceed 4 minutes of continuous operation per hour — if you're testing repeatedly while troubleshooting, give the motor a rest between attempts rather than running it back-to-back.</w:t>
+      </w:r>
+    </w:p>
+    <w:p>
+      <w:r>
+        <w:t xml:space="preserve">Full source: </w:t>
+      </w:r>
+      <w:r>
+        <w:rPr>
+          <w:b/>
+        </w:rPr>
+        <w:t>Girard GG750 Awning Installation, Service and Repair Manual</w:t>
+      </w:r>
+      <w:r>
+        <w:t xml:space="preserve"> (Rev. 01/22/2020), saved locally as Girard_GG750_Awning_Manual.pdf (../Girard_GG750_Awning_Manual.pdf), confirmed against the nameplate photographed on this coach's awning box (Girard_GG750_Awning_Nameplate.JPG (../Girard_GG750_Awning_Nameplate.JPG)).</w:t>
       </w:r>
     </w:p>
     <w:p>
@@ -597,7 +728,7 @@
         <w:rPr>
           <w:i/>
         </w:rPr>
-        <w:t>Companion documents: 27R_12V_Fuse_and_Breaker_Panel_Location.md/.docx (Coach 12V Panel and the CZone digital switching system) | Wiring_Diagrams/README.md (full diagram index, including the awning's connector detail in Wiring_Diagram_12Volt.pdf and Body_12V_Wiring_Installation.pdf)</w:t>
+        <w:t>Companion documents: 27R_12V_Fuse_and_Breaker_Panel_Location.md/.docx (Coach 12V Panel and the CZone digital switching system) | Wiring_Diagrams/README.md (full diagram index, including the awning's connector detail in Wiring_Diagram_12Volt.pdf and Body_12V_Wiring_Installation.pdf) | Girard_GG750_Awning_Manual.pdf (official manufacturer manual, saved locally in this folder)</w:t>
       </w:r>
     </w:p>
     <w:sectPr>

</xml_diff>

<commit_message>
Add low-voltage-under-load as a possible (unconfirmed) cause
Real-world observation: awning stalled at 13.2V house battery, moved
partway then fully retracted after starting the generator. Added as
its own diagnostic step, explicitly flagged as not yet confirmed —
Girard's own troubleshooting documents this exact "runs 10-12 inches
then stops" symptom as a possible undervoltage-at-the-motor issue,
and the coach's lithium battery normally rests around 13.6V, so 13.2V
was below that with less headroom under the motor's up-to-10A draw.
Recommends running the generator ~5 min to charge before retrying,
before escalating to a mechanical/dealer diagnosis.
</commit_message>
<xml_diff>
--- a/27R/27R_Awning_Not_Retracting_Troubleshooting.docx
+++ b/27R/27R_Awning_Not_Retracting_Troubleshooting.docx
@@ -378,6 +378,14 @@
       </w:r>
     </w:p>
     <w:p>
+      <w:pPr>
+        <w:pStyle w:val="ListBullet"/>
+      </w:pPr>
+      <w:r>
+        <w:t>It moves a short distance (roughly 10-12 inches) and then stops → this is a specific, documented symptom — go to the next step before assuming a mechanical or motor fault.</w:t>
+      </w:r>
+    </w:p>
+    <w:p>
       <w:r>
         <w:rPr>
           <w:i/>
@@ -393,7 +401,56 @@
         <w:pStyle w:val="Heading3"/>
       </w:pPr>
       <w:r>
-        <w:t>☐ 4. If it's silent: check WinConnect notifications and the Coach 12V Panel</w:t>
+        <w:t>☐ 4. If it moves partway then stops: check house battery voltage — possible, not yet confirmed — CHECK THIS</w:t>
+      </w:r>
+    </w:p>
+    <w:p>
+      <w:pPr>
+        <w:pStyle w:val="ListBullet"/>
+      </w:pPr>
+      <w:r>
+        <w:t>Girard's own troubleshooting guide for the GG750 documents this exact symptom: "The motor will operate for 10-12" and then stop... The motor may not be receiving enough power to operate correctly... Check to ensure that you have a minimum of 12VDC at the motor connection, if not switch on your generator or connect to shore power."</w:t>
+      </w:r>
+    </w:p>
+    <w:p>
+      <w:pPr>
+        <w:pStyle w:val="ListBullet"/>
+      </w:pPr>
+      <w:r>
+        <w:t>Check house battery voltage on WinConnect. This coach's lithium battery documentation lists a normal resting/float voltage of about 13.6V — if the reading is noticeably below that (e.g. ~13.2V), there may not be enough headroom left once the motor's current draw (up to 10A) pulls the voltage down further under load, especially over the wire run to a roof-mounted motor.</w:t>
+      </w:r>
+    </w:p>
+    <w:p>
+      <w:pPr>
+        <w:pStyle w:val="ListBullet"/>
+      </w:pPr>
+      <w:r>
+        <w:rPr>
+          <w:b/>
+        </w:rPr>
+        <w:t>Start the generator (or plug into shore power) and let it run for about 5 minutes to actually begin charging</w:t>
+      </w:r>
+      <w:r>
+        <w:t>, then retry retracting from the panel. This is a real fix Girard documents for this symptom, not a workaround — try it before escalating to Part 5.</w:t>
+      </w:r>
+    </w:p>
+    <w:p>
+      <w:r>
+        <w:rPr>
+          <w:i/>
+        </w:rPr>
+        <w:t>Why this matters:</w:t>
+      </w:r>
+      <w:r>
+        <w:t xml:space="preserve"> This isn't confirmed as the cause on this coach yet — but it's a specific, documented match for the exact symptom (partial movement then stall), it's non-invasive, and it takes 5 minutes to rule in or out before opening anything up mechanically.</w:t>
+      </w:r>
+    </w:p>
+    <w:p>
+      <w:pPr>
+        <w:pStyle w:val="Heading3"/>
+      </w:pPr>
+      <w:r>
+        <w:t>☐ 5. If it's silent: check WinConnect notifications and the Coach 12V Panel</w:t>
       </w:r>
     </w:p>
     <w:p>
@@ -436,7 +493,7 @@
         <w:pStyle w:val="Heading3"/>
       </w:pPr>
       <w:r>
-        <w:t>☐ 5. If it hums but doesn't move: inspect for a mechanical bind before forcing anything</w:t>
+        <w:t>☐ 6. If it hums but doesn't move: inspect for a mechanical bind before forcing anything</w:t>
       </w:r>
     </w:p>
     <w:p>
@@ -471,7 +528,7 @@
         <w:pStyle w:val="Heading3"/>
       </w:pPr>
       <w:r>
-        <w:t>☐ 6. If a notification points at the motion/wind sensor specifically</w:t>
+        <w:t>☐ 7. If a notification points at the motion/wind sensor specifically</w:t>
       </w:r>
     </w:p>
     <w:p>

</xml_diff>